<commit_message>
without reviewer you can move forward
</commit_message>
<xml_diff>
--- a/Vlims.DocumentMaster/DocumentWithMargins.docx
+++ b/Vlims.DocumentMaster/DocumentWithMargins.docx
@@ -10583,10 +10583,10 @@
       <w:tblLook w:firstRow="0" w:lastRow="0" w:firstColumn="0" w:lastColumn="0" w:noHBand="1" w:noVBand="1"/>
     </w:tblPr>
     <w:tblGrid>
-      <w:gridCol w:w="2159"/>
-      <w:gridCol w:w="2758"/>
-      <w:gridCol w:w="2758"/>
-      <w:gridCol w:w="2758"/>
+      <w:gridCol w:w="2293"/>
+      <w:gridCol w:w="2928"/>
+      <w:gridCol w:w="2283"/>
+      <w:gridCol w:w="2928"/>
     </w:tblGrid>
     <w:tr>
       <w:trPr>
@@ -10636,7 +10636,7 @@
         </w:tcPr>
         <w:p>
           <w:pPr>
-            <w:pStyle w:val="SpireTableThStyled46346a9-22f3-4255-b7c8-72661e40124c"/>
+            <w:pStyle w:val="SpireTableThStylef19c4701-188b-4527-bf04-aa3599ab3e1f"/>
             <w:jc w:val="left"/>
             <w:rPr>
               <w:vanish w:val="0"/>
@@ -10672,7 +10672,7 @@
         </w:tcPr>
         <w:p>
           <w:pPr>
-            <w:pStyle w:val="SpireTableThStylee3b626fc-f000-4acb-91a1-6c486323865b"/>
+            <w:pStyle w:val="SpireTableThStylee651c194-71be-4483-bfad-106b72612678"/>
             <w:jc w:val="left"/>
             <w:rPr>
               <w:vanish w:val="0"/>
@@ -10708,7 +10708,7 @@
         </w:tcPr>
         <w:p>
           <w:pPr>
-            <w:pStyle w:val="SpireTableThStylebb866b40-3444-42f8-abfb-30b530141043"/>
+            <w:pStyle w:val="SpireTableThStyle7c09a6f3-fc76-4c12-94a5-ff1fd3cd6391"/>
             <w:jc w:val="left"/>
             <w:rPr>
               <w:vanish w:val="0"/>
@@ -10749,7 +10749,7 @@
         </w:tcPr>
         <w:p>
           <w:pPr>
-            <w:pStyle w:val="SpireTableThStyle66568781-49ce-4d47-98c4-e795ad24a142"/>
+            <w:pStyle w:val="SpireTableThStylef8f4f3f3-96a1-4b1c-8c3d-53a10253a537"/>
             <w:jc w:val="left"/>
             <w:rPr>
               <w:vanish w:val="0"/>
@@ -10795,7 +10795,7 @@
               <w:b/>
               <w:sz w:val="21"/>
             </w:rPr>
-            <w:t xml:space="preserve">11/09/2024</w:t>
+            <w:t xml:space="preserve">14/09/2024</w:t>
           </w:r>
         </w:p>
       </w:tc>
@@ -10829,7 +10829,7 @@
               <w:b/>
               <w:sz w:val="21"/>
             </w:rPr>
-            <w:t xml:space="preserve">11/09/2024</w:t>
+            <w:t xml:space="preserve">---</w:t>
           </w:r>
         </w:p>
       </w:tc>
@@ -10863,7 +10863,7 @@
               <w:b/>
               <w:sz w:val="21"/>
             </w:rPr>
-            <w:t xml:space="preserve">11/09/2024</w:t>
+            <w:t xml:space="preserve">14/09/2024</w:t>
           </w:r>
         </w:p>
       </w:tc>
@@ -10892,7 +10892,7 @@
         </w:tcPr>
         <w:p>
           <w:pPr>
-            <w:pStyle w:val="SpireTableThStylebf1b18f5-be44-4dce-bca6-b31bfbd96808"/>
+            <w:pStyle w:val="SpireTableThStyle2f3c2f67-45d1-4af5-8599-f8572be4f8a7"/>
             <w:jc w:val="left"/>
             <w:rPr>
               <w:vanish w:val="0"/>
@@ -10972,7 +10972,7 @@
               <w:b/>
               <w:sz w:val="21"/>
             </w:rPr>
-            <w:t xml:space="preserve">Reviewer</w:t>
+            <w:t xml:space="preserve">---</w:t>
           </w:r>
         </w:p>
       </w:tc>
@@ -11035,7 +11035,7 @@
         </w:tcPr>
         <w:p>
           <w:pPr>
-            <w:pStyle w:val="SpireTableThStyle68f0c2f1-160a-4f58-b33e-91b160007150"/>
+            <w:pStyle w:val="SpireTableThStyle6e4413a3-dd26-4997-93e0-36d6e5596f9b"/>
             <w:jc w:val="left"/>
             <w:rPr>
               <w:vanish w:val="0"/>
@@ -11115,7 +11115,7 @@
               <w:b/>
               <w:sz w:val="21"/>
             </w:rPr>
-            <w:t xml:space="preserve">Reviewer</w:t>
+            <w:t xml:space="preserve">---</w:t>
           </w:r>
         </w:p>
       </w:tc>
@@ -11178,7 +11178,7 @@
         </w:tcPr>
         <w:p>
           <w:pPr>
-            <w:pStyle w:val="SpireTableThStylebc936f28-df2c-401d-99dd-9c9ec2281785"/>
+            <w:pStyle w:val="SpireTableThStyled7eb7b53-8881-4400-b562-5ae70a7172cd"/>
             <w:jc w:val="left"/>
             <w:rPr>
               <w:vanish w:val="0"/>
@@ -11258,7 +11258,7 @@
               <w:b/>
               <w:sz w:val="21"/>
             </w:rPr>
-            <w:t xml:space="preserve">PRODUCTION</w:t>
+            <w:t xml:space="preserve">---</w:t>
           </w:r>
         </w:p>
       </w:tc>
@@ -11361,7 +11361,7 @@
               <w:b/>
               <w:sz w:val="14"/>
             </w:rPr>
-            <w:t xml:space="preserve">Format No : APD/QAD/SOP/SOP</w:t>
+            <w:t xml:space="preserve">Format No : APD/QAD/SOP/sop1409</w:t>
           </w:r>
         </w:p>
       </w:tc>
@@ -11479,9 +11479,9 @@
     </w:tblPr>
     <w:tblGrid>
       <w:gridCol w:w="1680"/>
-      <w:gridCol w:w="2727"/>
-      <w:gridCol w:w="2710"/>
-      <w:gridCol w:w="3315"/>
+      <w:gridCol w:w="3733"/>
+      <w:gridCol w:w="2257"/>
+      <w:gridCol w:w="2761"/>
     </w:tblGrid>
     <w:tr>
       <w:trPr>
@@ -11509,7 +11509,7 @@
         </w:tcPr>
         <w:p>
           <w:pPr>
-            <w:pStyle w:val="SpireTableThStyle58e9213e-1c86-43be-ad7c-bb5550646b05"/>
+            <w:pStyle w:val="SpireTableThStyle235a97f9-f38e-4783-b6a9-fe7f2817de2b"/>
             <w:jc w:val="left"/>
             <w:rPr>
               <w:vanish w:val="0"/>
@@ -11564,7 +11564,7 @@
         </w:tcPr>
         <w:p>
           <w:pPr>
-            <w:pStyle w:val="SpireTableThStyle5fd8c1f2-a300-40db-a1e4-e5b852054509"/>
+            <w:pStyle w:val="SpireTableThStyle922bbfe3-6aa1-45c1-8c6b-993db7862ec6"/>
             <w:jc w:val="center"/>
             <w:rPr>
               <w:vanish w:val="0"/>
@@ -11673,7 +11673,7 @@
               <w:b/>
               <w:sz w:val="18"/>
             </w:rPr>
-            <w:t xml:space="preserve"> Procedure For Training Of All The Employees</w:t>
+            <w:t xml:space="preserve"> 1409 Title</w:t>
           </w:r>
         </w:p>
       </w:tc>
@@ -11747,7 +11747,7 @@
               <w:b/>
               <w:sz w:val="18"/>
             </w:rPr>
-            <w:t xml:space="preserve">APD/QAD/012</w:t>
+            <w:t xml:space="preserve">APD/QAD/SOP-SOP1409</w:t>
           </w:r>
         </w:p>
       </w:tc>
@@ -11815,7 +11815,7 @@
               <w:b/>
               <w:sz w:val="18"/>
             </w:rPr>
-            <w:t xml:space="preserve">11</w:t>
+            <w:t xml:space="preserve">00</w:t>
           </w:r>
         </w:p>
       </w:tc>
@@ -11889,7 +11889,7 @@
               <w:b/>
               <w:sz w:val="18"/>
             </w:rPr>
-            <w:t xml:space="preserve">10</w:t>
+            <w:t xml:space="preserve">01</w:t>
           </w:r>
         </w:p>
       </w:tc>
@@ -12031,7 +12031,7 @@
               <w:b/>
               <w:sz w:val="18"/>
             </w:rPr>
-            <w:t xml:space="preserve">11/09/2024</w:t>
+            <w:t xml:space="preserve">14/09/2024</w:t>
           </w:r>
         </w:p>
       </w:tc>
@@ -12099,7 +12099,7 @@
               <w:b/>
               <w:sz w:val="18"/>
             </w:rPr>
-            <w:t xml:space="preserve">12/09/2024</w:t>
+            <w:t xml:space="preserve">15/09/2024</w:t>
           </w:r>
         </w:p>
       </w:tc>
@@ -14663,8 +14663,8 @@
       <w:szCs w:val="24"/>
     </w:rPr>
   </w:style>
-  <w:style w:type="paragraph" w:styleId="SpireTableThStyled46346a9-22f3-4255-b7c8-72661e40124c">
-    <w:name w:val="SpireTableThStyled46346a9-22f3-4255-b7c8-72661e40124c"/>
+  <w:style w:type="paragraph" w:styleId="SpireTableThStylef19c4701-188b-4527-bf04-aa3599ab3e1f">
+    <w:name w:val="SpireTableThStylef19c4701-188b-4527-bf04-aa3599ab3e1f"/>
     <w:basedOn w:val="Normal"/>
     <w:qFormat/>
     <w:pPr>
@@ -14680,8 +14680,8 @@
       <w:lang w:val="en-US"/>
     </w:rPr>
   </w:style>
-  <w:style w:type="paragraph" w:styleId="SpireTableThStylee3b626fc-f000-4acb-91a1-6c486323865b">
-    <w:name w:val="SpireTableThStylee3b626fc-f000-4acb-91a1-6c486323865b"/>
+  <w:style w:type="paragraph" w:styleId="SpireTableThStylee651c194-71be-4483-bfad-106b72612678">
+    <w:name w:val="SpireTableThStylee651c194-71be-4483-bfad-106b72612678"/>
     <w:basedOn w:val="Normal"/>
     <w:qFormat/>
     <w:pPr>
@@ -14697,8 +14697,8 @@
       <w:lang w:val="en-US"/>
     </w:rPr>
   </w:style>
-  <w:style w:type="paragraph" w:styleId="SpireTableThStylebb866b40-3444-42f8-abfb-30b530141043">
-    <w:name w:val="SpireTableThStylebb866b40-3444-42f8-abfb-30b530141043"/>
+  <w:style w:type="paragraph" w:styleId="SpireTableThStyle7c09a6f3-fc76-4c12-94a5-ff1fd3cd6391">
+    <w:name w:val="SpireTableThStyle7c09a6f3-fc76-4c12-94a5-ff1fd3cd6391"/>
     <w:basedOn w:val="Normal"/>
     <w:qFormat/>
     <w:pPr>
@@ -14714,8 +14714,8 @@
       <w:lang w:val="en-US"/>
     </w:rPr>
   </w:style>
-  <w:style w:type="paragraph" w:styleId="SpireTableThStyle66568781-49ce-4d47-98c4-e795ad24a142">
-    <w:name w:val="SpireTableThStyle66568781-49ce-4d47-98c4-e795ad24a142"/>
+  <w:style w:type="paragraph" w:styleId="SpireTableThStylef8f4f3f3-96a1-4b1c-8c3d-53a10253a537">
+    <w:name w:val="SpireTableThStylef8f4f3f3-96a1-4b1c-8c3d-53a10253a537"/>
     <w:basedOn w:val="Normal"/>
     <w:qFormat/>
     <w:pPr>
@@ -14731,8 +14731,8 @@
       <w:lang w:val="en-US"/>
     </w:rPr>
   </w:style>
-  <w:style w:type="paragraph" w:styleId="SpireTableThStylebf1b18f5-be44-4dce-bca6-b31bfbd96808">
-    <w:name w:val="SpireTableThStylebf1b18f5-be44-4dce-bca6-b31bfbd96808"/>
+  <w:style w:type="paragraph" w:styleId="SpireTableThStyle2f3c2f67-45d1-4af5-8599-f8572be4f8a7">
+    <w:name w:val="SpireTableThStyle2f3c2f67-45d1-4af5-8599-f8572be4f8a7"/>
     <w:basedOn w:val="Normal"/>
     <w:qFormat/>
     <w:pPr>
@@ -14748,8 +14748,8 @@
       <w:lang w:val="en-US"/>
     </w:rPr>
   </w:style>
-  <w:style w:type="paragraph" w:styleId="SpireTableThStyle68f0c2f1-160a-4f58-b33e-91b160007150">
-    <w:name w:val="SpireTableThStyle68f0c2f1-160a-4f58-b33e-91b160007150"/>
+  <w:style w:type="paragraph" w:styleId="SpireTableThStyle6e4413a3-dd26-4997-93e0-36d6e5596f9b">
+    <w:name w:val="SpireTableThStyle6e4413a3-dd26-4997-93e0-36d6e5596f9b"/>
     <w:basedOn w:val="Normal"/>
     <w:qFormat/>
     <w:pPr>
@@ -14765,8 +14765,8 @@
       <w:lang w:val="en-US"/>
     </w:rPr>
   </w:style>
-  <w:style w:type="paragraph" w:styleId="SpireTableThStylebc936f28-df2c-401d-99dd-9c9ec2281785">
-    <w:name w:val="SpireTableThStylebc936f28-df2c-401d-99dd-9c9ec2281785"/>
+  <w:style w:type="paragraph" w:styleId="SpireTableThStyled7eb7b53-8881-4400-b562-5ae70a7172cd">
+    <w:name w:val="SpireTableThStyled7eb7b53-8881-4400-b562-5ae70a7172cd"/>
     <w:basedOn w:val="Normal"/>
     <w:qFormat/>
     <w:pPr>
@@ -14782,8 +14782,8 @@
       <w:lang w:val="en-US"/>
     </w:rPr>
   </w:style>
-  <w:style w:type="paragraph" w:styleId="SpireTableThStyle58e9213e-1c86-43be-ad7c-bb5550646b05">
-    <w:name w:val="SpireTableThStyle58e9213e-1c86-43be-ad7c-bb5550646b05"/>
+  <w:style w:type="paragraph" w:styleId="SpireTableThStyle235a97f9-f38e-4783-b6a9-fe7f2817de2b">
+    <w:name w:val="SpireTableThStyle235a97f9-f38e-4783-b6a9-fe7f2817de2b"/>
     <w:basedOn w:val="Normal"/>
     <w:qFormat/>
     <w:pPr>
@@ -14799,8 +14799,8 @@
       <w:lang w:val="en-US"/>
     </w:rPr>
   </w:style>
-  <w:style w:type="paragraph" w:styleId="SpireTableThStyle5fd8c1f2-a300-40db-a1e4-e5b852054509">
-    <w:name w:val="SpireTableThStyle5fd8c1f2-a300-40db-a1e4-e5b852054509"/>
+  <w:style w:type="paragraph" w:styleId="SpireTableThStyle922bbfe3-6aa1-45c1-8c6b-993db7862ec6">
+    <w:name w:val="SpireTableThStyle922bbfe3-6aa1-45c1-8c6b-993db7862ec6"/>
     <w:basedOn w:val="Normal"/>
     <w:qFormat/>
     <w:pPr>

</xml_diff>

<commit_message>
all documenys allignment changes
</commit_message>
<xml_diff>
--- a/Vlims.DocumentMaster/DocumentWithMargins.docx
+++ b/Vlims.DocumentMaster/DocumentWithMargins.docx
@@ -33,6 +33,10 @@
       <w:r>
         <w:rPr/>
         <w:t xml:space="preserve"> </w:t>
+      </w:r>
+      <w:r>
+        <w:rPr/>
+        <w:t xml:space="preserve">Revision</w:t>
       </w:r>
     </w:p>
     <w:p>
@@ -5648,16 +5652,7 @@
               <w:rPr>
                 <w:lang w:bidi="th-TH"/>
               </w:rPr>
-              <w:t xml:space="preserve">Failure causes customer dissatisfaction. Customer is made uncomfortable or is annoyed b</w:t>
-            </w:r>
-            <w:bookmarkStart w:id="0" w:name="_GoBack"/>
-            <w:bookmarkEnd w:id="0"/>
-            <w:r>
-              <m:rPr/>
-              <w:rPr>
-                <w:lang w:bidi="th-TH"/>
-              </w:rPr>
-              <w:t xml:space="preserve">y the failure.</w:t>
+              <w:t xml:space="preserve">Failure causes customer dissatisfaction. Customer is made uncomfortable or is annoyed by the failure.</w:t>
             </w:r>
           </w:p>
         </w:tc>
@@ -10583,10 +10578,10 @@
       <w:tblLook w:firstRow="0" w:lastRow="0" w:firstColumn="0" w:lastColumn="0" w:noHBand="1" w:noVBand="1"/>
     </w:tblPr>
     <w:tblGrid>
-      <w:gridCol w:w="2293"/>
-      <w:gridCol w:w="2928"/>
-      <w:gridCol w:w="2283"/>
-      <w:gridCol w:w="2928"/>
+      <w:gridCol w:w="2286"/>
+      <w:gridCol w:w="2935"/>
+      <w:gridCol w:w="2276"/>
+      <w:gridCol w:w="2935"/>
     </w:tblGrid>
     <w:tr>
       <w:trPr>
@@ -10605,12 +10600,12 @@
             <w:insideV w:val="single" w:sz="4" w:space="0" w:color="auto"/>
           </w:tcBorders>
           <w:tcMar>
-            <w:top w:w="75" w:type="dxa"/>
-            <w:left w:w="75" w:type="dxa"/>
-            <w:bottom w:w="75" w:type="dxa"/>
-            <w:right w:w="75" w:type="dxa"/>
+            <w:top w:w="16" w:type="dxa"/>
+            <w:left w:w="140" w:type="dxa"/>
+            <w:bottom w:w="16" w:type="dxa"/>
+            <w:right w:w="0" w:type="dxa"/>
           </w:tcMar>
-          <w:vAlign w:val="center"/>
+          <w:vAlign w:val="top"/>
         </w:tcPr>
         <w:p>
           <w:pPr/>
@@ -10627,17 +10622,17 @@
             <w:insideV w:val="single" w:sz="4" w:space="0" w:color="auto"/>
           </w:tcBorders>
           <w:tcMar>
-            <w:top w:w="75" w:type="dxa"/>
-            <w:left w:w="75" w:type="dxa"/>
-            <w:bottom w:w="75" w:type="dxa"/>
-            <w:right w:w="75" w:type="dxa"/>
+            <w:top w:w="16" w:type="dxa"/>
+            <w:left w:w="140" w:type="dxa"/>
+            <w:bottom w:w="16" w:type="dxa"/>
+            <w:right w:w="0" w:type="dxa"/>
           </w:tcMar>
           <w:vAlign w:val="top"/>
         </w:tcPr>
         <w:p>
           <w:pPr>
-            <w:pStyle w:val="SpireTableThStylef19c4701-188b-4527-bf04-aa3599ab3e1f"/>
-            <w:jc w:val="left"/>
+            <w:pStyle w:val="SpireTableThStyle57247c50-495b-4fae-824c-23ec4621684f"/>
+            <w:jc w:val="center"/>
             <w:rPr>
               <w:vanish w:val="0"/>
             </w:rPr>
@@ -10646,7 +10641,7 @@
             <w:rPr>
               <w:rFonts w:ascii="&quot;times new roman&quot;" w:eastAsia="&quot;times new roman&quot;" w:hAnsi="&quot;times new roman&quot;" w:cs="&quot;times new roman&quot;"/>
               <w:b/>
-              <w:sz w:val="21"/>
+              <w:sz w:val="24"/>
             </w:rPr>
             <w:t xml:space="preserve">Prepared By</w:t>
           </w:r>
@@ -10663,17 +10658,17 @@
             <w:insideV w:val="single" w:sz="4" w:space="0" w:color="auto"/>
           </w:tcBorders>
           <w:tcMar>
-            <w:top w:w="75" w:type="dxa"/>
-            <w:left w:w="75" w:type="dxa"/>
-            <w:bottom w:w="75" w:type="dxa"/>
-            <w:right w:w="75" w:type="dxa"/>
+            <w:top w:w="16" w:type="dxa"/>
+            <w:left w:w="140" w:type="dxa"/>
+            <w:bottom w:w="16" w:type="dxa"/>
+            <w:right w:w="0" w:type="dxa"/>
           </w:tcMar>
           <w:vAlign w:val="top"/>
         </w:tcPr>
         <w:p>
           <w:pPr>
-            <w:pStyle w:val="SpireTableThStylee651c194-71be-4483-bfad-106b72612678"/>
-            <w:jc w:val="left"/>
+            <w:pStyle w:val="SpireTableThStyle78ea8cc0-127c-467c-82a0-acd754a42ee8"/>
+            <w:jc w:val="center"/>
             <w:rPr>
               <w:vanish w:val="0"/>
             </w:rPr>
@@ -10682,7 +10677,7 @@
             <w:rPr>
               <w:rFonts w:ascii="&quot;times new roman&quot;" w:eastAsia="&quot;times new roman&quot;" w:hAnsi="&quot;times new roman&quot;" w:cs="&quot;times new roman&quot;"/>
               <w:b/>
-              <w:sz w:val="21"/>
+              <w:sz w:val="24"/>
             </w:rPr>
             <w:t xml:space="preserve">Checked By</w:t>
           </w:r>
@@ -10699,17 +10694,17 @@
             <w:insideV w:val="single" w:sz="4" w:space="0" w:color="auto"/>
           </w:tcBorders>
           <w:tcMar>
-            <w:top w:w="75" w:type="dxa"/>
-            <w:left w:w="75" w:type="dxa"/>
-            <w:bottom w:w="75" w:type="dxa"/>
-            <w:right w:w="75" w:type="dxa"/>
+            <w:top w:w="16" w:type="dxa"/>
+            <w:left w:w="140" w:type="dxa"/>
+            <w:bottom w:w="16" w:type="dxa"/>
+            <w:right w:w="0" w:type="dxa"/>
           </w:tcMar>
           <w:vAlign w:val="top"/>
         </w:tcPr>
         <w:p>
           <w:pPr>
-            <w:pStyle w:val="SpireTableThStyle7c09a6f3-fc76-4c12-94a5-ff1fd3cd6391"/>
-            <w:jc w:val="left"/>
+            <w:pStyle w:val="SpireTableThStyle1349b3a3-57aa-4ec2-8965-ed168f1ab5df"/>
+            <w:jc w:val="center"/>
             <w:rPr>
               <w:vanish w:val="0"/>
             </w:rPr>
@@ -10718,7 +10713,7 @@
             <w:rPr>
               <w:rFonts w:ascii="&quot;times new roman&quot;" w:eastAsia="&quot;times new roman&quot;" w:hAnsi="&quot;times new roman&quot;" w:cs="&quot;times new roman&quot;"/>
               <w:b/>
-              <w:sz w:val="21"/>
+              <w:sz w:val="24"/>
             </w:rPr>
             <w:t xml:space="preserve">Approved By</w:t>
           </w:r>
@@ -10741,15 +10736,15 @@
             <w:insideV w:val="single" w:sz="4" w:space="0" w:color="auto"/>
           </w:tcBorders>
           <w:tcMar>
-            <w:top w:w="75" w:type="dxa"/>
-            <w:left w:w="75" w:type="dxa"/>
-            <w:bottom w:w="75" w:type="dxa"/>
-            <w:right w:w="75" w:type="dxa"/>
+            <w:top w:w="16" w:type="dxa"/>
+            <w:left w:w="140" w:type="dxa"/>
+            <w:bottom w:w="16" w:type="dxa"/>
+            <w:right w:w="0" w:type="dxa"/>
           </w:tcMar>
         </w:tcPr>
         <w:p>
           <w:pPr>
-            <w:pStyle w:val="SpireTableThStylef8f4f3f3-96a1-4b1c-8c3d-53a10253a537"/>
+            <w:pStyle w:val="SpireTableThStyleb74160e4-164a-4bdb-af11-2e3315db5247"/>
             <w:jc w:val="left"/>
             <w:rPr>
               <w:vanish w:val="0"/>
@@ -10759,7 +10754,7 @@
             <w:rPr>
               <w:rFonts w:ascii="&quot;times new roman&quot;" w:eastAsia="&quot;times new roman&quot;" w:hAnsi="&quot;times new roman&quot;" w:cs="&quot;times new roman&quot;"/>
               <w:b/>
-              <w:sz w:val="21"/>
+              <w:sz w:val="24"/>
             </w:rPr>
             <w:t xml:space="preserve">Date</w:t>
           </w:r>
@@ -10776,15 +10771,15 @@
             <w:insideV w:val="single" w:sz="4" w:space="0" w:color="auto"/>
           </w:tcBorders>
           <w:tcMar>
-            <w:top w:w="75" w:type="dxa"/>
-            <w:left w:w="75" w:type="dxa"/>
-            <w:bottom w:w="75" w:type="dxa"/>
-            <w:right w:w="75" w:type="dxa"/>
+            <w:top w:w="16" w:type="dxa"/>
+            <w:left w:w="140" w:type="dxa"/>
+            <w:bottom w:w="16" w:type="dxa"/>
+            <w:right w:w="0" w:type="dxa"/>
           </w:tcMar>
         </w:tcPr>
         <w:p>
           <w:pPr>
-            <w:jc w:val="left"/>
+            <w:jc w:val="center"/>
             <w:rPr>
               <w:vanish w:val="0"/>
             </w:rPr>
@@ -10793,9 +10788,9 @@
             <w:rPr>
               <w:rFonts w:ascii="&quot;times new roman&quot;" w:eastAsia="&quot;times new roman&quot;" w:hAnsi="&quot;times new roman&quot;" w:cs="&quot;times new roman&quot;"/>
               <w:b/>
-              <w:sz w:val="21"/>
+              <w:sz w:val="24"/>
             </w:rPr>
-            <w:t xml:space="preserve">14/09/2024</w:t>
+            <w:t xml:space="preserve">16/09/2024</w:t>
           </w:r>
         </w:p>
       </w:tc>
@@ -10810,15 +10805,15 @@
             <w:insideV w:val="single" w:sz="4" w:space="0" w:color="auto"/>
           </w:tcBorders>
           <w:tcMar>
-            <w:top w:w="75" w:type="dxa"/>
-            <w:left w:w="75" w:type="dxa"/>
-            <w:bottom w:w="75" w:type="dxa"/>
-            <w:right w:w="75" w:type="dxa"/>
+            <w:top w:w="16" w:type="dxa"/>
+            <w:left w:w="140" w:type="dxa"/>
+            <w:bottom w:w="16" w:type="dxa"/>
+            <w:right w:w="0" w:type="dxa"/>
           </w:tcMar>
         </w:tcPr>
         <w:p>
           <w:pPr>
-            <w:jc w:val="left"/>
+            <w:jc w:val="center"/>
             <w:rPr>
               <w:vanish w:val="0"/>
             </w:rPr>
@@ -10827,7 +10822,7 @@
             <w:rPr>
               <w:rFonts w:ascii="&quot;times new roman&quot;" w:eastAsia="&quot;times new roman&quot;" w:hAnsi="&quot;times new roman&quot;" w:cs="&quot;times new roman&quot;"/>
               <w:b/>
-              <w:sz w:val="21"/>
+              <w:sz w:val="24"/>
             </w:rPr>
             <w:t xml:space="preserve">---</w:t>
           </w:r>
@@ -10844,15 +10839,15 @@
             <w:insideV w:val="single" w:sz="4" w:space="0" w:color="auto"/>
           </w:tcBorders>
           <w:tcMar>
-            <w:top w:w="75" w:type="dxa"/>
-            <w:left w:w="75" w:type="dxa"/>
-            <w:bottom w:w="75" w:type="dxa"/>
-            <w:right w:w="75" w:type="dxa"/>
+            <w:top w:w="16" w:type="dxa"/>
+            <w:left w:w="140" w:type="dxa"/>
+            <w:bottom w:w="16" w:type="dxa"/>
+            <w:right w:w="0" w:type="dxa"/>
           </w:tcMar>
         </w:tcPr>
         <w:p>
           <w:pPr>
-            <w:jc w:val="left"/>
+            <w:jc w:val="center"/>
             <w:rPr>
               <w:vanish w:val="0"/>
             </w:rPr>
@@ -10861,9 +10856,9 @@
             <w:rPr>
               <w:rFonts w:ascii="&quot;times new roman&quot;" w:eastAsia="&quot;times new roman&quot;" w:hAnsi="&quot;times new roman&quot;" w:cs="&quot;times new roman&quot;"/>
               <w:b/>
-              <w:sz w:val="21"/>
+              <w:sz w:val="24"/>
             </w:rPr>
-            <w:t xml:space="preserve">14/09/2024</w:t>
+            <w:t xml:space="preserve">16/09/2024</w:t>
           </w:r>
         </w:p>
       </w:tc>
@@ -10884,15 +10879,15 @@
             <w:insideV w:val="single" w:sz="4" w:space="0" w:color="auto"/>
           </w:tcBorders>
           <w:tcMar>
-            <w:top w:w="75" w:type="dxa"/>
-            <w:left w:w="75" w:type="dxa"/>
-            <w:bottom w:w="75" w:type="dxa"/>
-            <w:right w:w="75" w:type="dxa"/>
+            <w:top w:w="16" w:type="dxa"/>
+            <w:left w:w="140" w:type="dxa"/>
+            <w:bottom w:w="16" w:type="dxa"/>
+            <w:right w:w="0" w:type="dxa"/>
           </w:tcMar>
         </w:tcPr>
         <w:p>
           <w:pPr>
-            <w:pStyle w:val="SpireTableThStyle2f3c2f67-45d1-4af5-8599-f8572be4f8a7"/>
+            <w:pStyle w:val="SpireTableThStyle8c685bca-0258-4110-99d4-33703147a4ab"/>
             <w:jc w:val="left"/>
             <w:rPr>
               <w:vanish w:val="0"/>
@@ -10902,7 +10897,7 @@
             <w:rPr>
               <w:rFonts w:ascii="&quot;times new roman&quot;" w:eastAsia="&quot;times new roman&quot;" w:hAnsi="&quot;times new roman&quot;" w:cs="&quot;times new roman&quot;"/>
               <w:b/>
-              <w:sz w:val="21"/>
+              <w:sz w:val="24"/>
             </w:rPr>
             <w:t xml:space="preserve">Name</w:t>
           </w:r>
@@ -10919,15 +10914,15 @@
             <w:insideV w:val="single" w:sz="4" w:space="0" w:color="auto"/>
           </w:tcBorders>
           <w:tcMar>
-            <w:top w:w="75" w:type="dxa"/>
-            <w:left w:w="75" w:type="dxa"/>
-            <w:bottom w:w="75" w:type="dxa"/>
-            <w:right w:w="75" w:type="dxa"/>
+            <w:top w:w="16" w:type="dxa"/>
+            <w:left w:w="140" w:type="dxa"/>
+            <w:bottom w:w="16" w:type="dxa"/>
+            <w:right w:w="0" w:type="dxa"/>
           </w:tcMar>
         </w:tcPr>
         <w:p>
           <w:pPr>
-            <w:jc w:val="left"/>
+            <w:jc w:val="center"/>
             <w:rPr>
               <w:vanish w:val="0"/>
             </w:rPr>
@@ -10936,7 +10931,7 @@
             <w:rPr>
               <w:rFonts w:ascii="&quot;times new roman&quot;" w:eastAsia="&quot;times new roman&quot;" w:hAnsi="&quot;times new roman&quot;" w:cs="&quot;times new roman&quot;"/>
               <w:b/>
-              <w:sz w:val="21"/>
+              <w:sz w:val="24"/>
             </w:rPr>
             <w:t xml:space="preserve">Initiator</w:t>
           </w:r>
@@ -10953,15 +10948,15 @@
             <w:insideV w:val="single" w:sz="4" w:space="0" w:color="auto"/>
           </w:tcBorders>
           <w:tcMar>
-            <w:top w:w="75" w:type="dxa"/>
-            <w:left w:w="75" w:type="dxa"/>
-            <w:bottom w:w="75" w:type="dxa"/>
-            <w:right w:w="75" w:type="dxa"/>
+            <w:top w:w="16" w:type="dxa"/>
+            <w:left w:w="140" w:type="dxa"/>
+            <w:bottom w:w="16" w:type="dxa"/>
+            <w:right w:w="0" w:type="dxa"/>
           </w:tcMar>
         </w:tcPr>
         <w:p>
           <w:pPr>
-            <w:jc w:val="left"/>
+            <w:jc w:val="center"/>
             <w:rPr>
               <w:vanish w:val="0"/>
             </w:rPr>
@@ -10970,7 +10965,7 @@
             <w:rPr>
               <w:rFonts w:ascii="&quot;times new roman&quot;" w:eastAsia="&quot;times new roman&quot;" w:hAnsi="&quot;times new roman&quot;" w:cs="&quot;times new roman&quot;"/>
               <w:b/>
-              <w:sz w:val="21"/>
+              <w:sz w:val="24"/>
             </w:rPr>
             <w:t xml:space="preserve">---</w:t>
           </w:r>
@@ -10987,15 +10982,15 @@
             <w:insideV w:val="single" w:sz="4" w:space="0" w:color="auto"/>
           </w:tcBorders>
           <w:tcMar>
-            <w:top w:w="75" w:type="dxa"/>
-            <w:left w:w="75" w:type="dxa"/>
-            <w:bottom w:w="75" w:type="dxa"/>
-            <w:right w:w="75" w:type="dxa"/>
+            <w:top w:w="16" w:type="dxa"/>
+            <w:left w:w="140" w:type="dxa"/>
+            <w:bottom w:w="16" w:type="dxa"/>
+            <w:right w:w="0" w:type="dxa"/>
           </w:tcMar>
         </w:tcPr>
         <w:p>
           <w:pPr>
-            <w:jc w:val="left"/>
+            <w:jc w:val="center"/>
             <w:rPr>
               <w:vanish w:val="0"/>
             </w:rPr>
@@ -11004,7 +10999,7 @@
             <w:rPr>
               <w:rFonts w:ascii="&quot;times new roman&quot;" w:eastAsia="&quot;times new roman&quot;" w:hAnsi="&quot;times new roman&quot;" w:cs="&quot;times new roman&quot;"/>
               <w:b/>
-              <w:sz w:val="21"/>
+              <w:sz w:val="24"/>
             </w:rPr>
             <w:t xml:space="preserve">Approver</w:t>
           </w:r>
@@ -11027,15 +11022,15 @@
             <w:insideV w:val="single" w:sz="4" w:space="0" w:color="auto"/>
           </w:tcBorders>
           <w:tcMar>
-            <w:top w:w="75" w:type="dxa"/>
-            <w:left w:w="75" w:type="dxa"/>
-            <w:bottom w:w="75" w:type="dxa"/>
-            <w:right w:w="75" w:type="dxa"/>
+            <w:top w:w="16" w:type="dxa"/>
+            <w:left w:w="140" w:type="dxa"/>
+            <w:bottom w:w="16" w:type="dxa"/>
+            <w:right w:w="0" w:type="dxa"/>
           </w:tcMar>
         </w:tcPr>
         <w:p>
           <w:pPr>
-            <w:pStyle w:val="SpireTableThStyle6e4413a3-dd26-4997-93e0-36d6e5596f9b"/>
+            <w:pStyle w:val="SpireTableThStyle5c0fc8d8-3484-462c-b770-ea2d18f3fd3f"/>
             <w:jc w:val="left"/>
             <w:rPr>
               <w:vanish w:val="0"/>
@@ -11045,7 +11040,7 @@
             <w:rPr>
               <w:rFonts w:ascii="&quot;times new roman&quot;" w:eastAsia="&quot;times new roman&quot;" w:hAnsi="&quot;times new roman&quot;" w:cs="&quot;times new roman&quot;"/>
               <w:b/>
-              <w:sz w:val="21"/>
+              <w:sz w:val="24"/>
             </w:rPr>
             <w:t xml:space="preserve">Designation</w:t>
           </w:r>
@@ -11062,15 +11057,15 @@
             <w:insideV w:val="single" w:sz="4" w:space="0" w:color="auto"/>
           </w:tcBorders>
           <w:tcMar>
-            <w:top w:w="75" w:type="dxa"/>
-            <w:left w:w="75" w:type="dxa"/>
-            <w:bottom w:w="75" w:type="dxa"/>
-            <w:right w:w="75" w:type="dxa"/>
+            <w:top w:w="16" w:type="dxa"/>
+            <w:left w:w="140" w:type="dxa"/>
+            <w:bottom w:w="16" w:type="dxa"/>
+            <w:right w:w="0" w:type="dxa"/>
           </w:tcMar>
         </w:tcPr>
         <w:p>
           <w:pPr>
-            <w:jc w:val="left"/>
+            <w:jc w:val="center"/>
             <w:rPr>
               <w:vanish w:val="0"/>
             </w:rPr>
@@ -11079,7 +11074,7 @@
             <w:rPr>
               <w:rFonts w:ascii="&quot;times new roman&quot;" w:eastAsia="&quot;times new roman&quot;" w:hAnsi="&quot;times new roman&quot;" w:cs="&quot;times new roman&quot;"/>
               <w:b/>
-              <w:sz w:val="21"/>
+              <w:sz w:val="24"/>
             </w:rPr>
             <w:t xml:space="preserve">Initiator</w:t>
           </w:r>
@@ -11096,15 +11091,15 @@
             <w:insideV w:val="single" w:sz="4" w:space="0" w:color="auto"/>
           </w:tcBorders>
           <w:tcMar>
-            <w:top w:w="75" w:type="dxa"/>
-            <w:left w:w="75" w:type="dxa"/>
-            <w:bottom w:w="75" w:type="dxa"/>
-            <w:right w:w="75" w:type="dxa"/>
+            <w:top w:w="16" w:type="dxa"/>
+            <w:left w:w="140" w:type="dxa"/>
+            <w:bottom w:w="16" w:type="dxa"/>
+            <w:right w:w="0" w:type="dxa"/>
           </w:tcMar>
         </w:tcPr>
         <w:p>
           <w:pPr>
-            <w:jc w:val="left"/>
+            <w:jc w:val="center"/>
             <w:rPr>
               <w:vanish w:val="0"/>
             </w:rPr>
@@ -11113,7 +11108,7 @@
             <w:rPr>
               <w:rFonts w:ascii="&quot;times new roman&quot;" w:eastAsia="&quot;times new roman&quot;" w:hAnsi="&quot;times new roman&quot;" w:cs="&quot;times new roman&quot;"/>
               <w:b/>
-              <w:sz w:val="21"/>
+              <w:sz w:val="24"/>
             </w:rPr>
             <w:t xml:space="preserve">---</w:t>
           </w:r>
@@ -11130,15 +11125,15 @@
             <w:insideV w:val="single" w:sz="4" w:space="0" w:color="auto"/>
           </w:tcBorders>
           <w:tcMar>
-            <w:top w:w="75" w:type="dxa"/>
-            <w:left w:w="75" w:type="dxa"/>
-            <w:bottom w:w="75" w:type="dxa"/>
-            <w:right w:w="75" w:type="dxa"/>
+            <w:top w:w="16" w:type="dxa"/>
+            <w:left w:w="140" w:type="dxa"/>
+            <w:bottom w:w="16" w:type="dxa"/>
+            <w:right w:w="0" w:type="dxa"/>
           </w:tcMar>
         </w:tcPr>
         <w:p>
           <w:pPr>
-            <w:jc w:val="left"/>
+            <w:jc w:val="center"/>
             <w:rPr>
               <w:vanish w:val="0"/>
             </w:rPr>
@@ -11147,7 +11142,7 @@
             <w:rPr>
               <w:rFonts w:ascii="&quot;times new roman&quot;" w:eastAsia="&quot;times new roman&quot;" w:hAnsi="&quot;times new roman&quot;" w:cs="&quot;times new roman&quot;"/>
               <w:b/>
-              <w:sz w:val="21"/>
+              <w:sz w:val="24"/>
             </w:rPr>
             <w:t xml:space="preserve">Approver</w:t>
           </w:r>
@@ -11170,15 +11165,15 @@
             <w:insideV w:val="single" w:sz="4" w:space="0" w:color="auto"/>
           </w:tcBorders>
           <w:tcMar>
-            <w:top w:w="75" w:type="dxa"/>
-            <w:left w:w="75" w:type="dxa"/>
-            <w:bottom w:w="75" w:type="dxa"/>
-            <w:right w:w="75" w:type="dxa"/>
+            <w:top w:w="16" w:type="dxa"/>
+            <w:left w:w="140" w:type="dxa"/>
+            <w:bottom w:w="16" w:type="dxa"/>
+            <w:right w:w="0" w:type="dxa"/>
           </w:tcMar>
         </w:tcPr>
         <w:p>
           <w:pPr>
-            <w:pStyle w:val="SpireTableThStyled7eb7b53-8881-4400-b562-5ae70a7172cd"/>
+            <w:pStyle w:val="SpireTableThStylec583315a-e7d0-4bda-b2b3-b6c05bf383cf"/>
             <w:jc w:val="left"/>
             <w:rPr>
               <w:vanish w:val="0"/>
@@ -11188,7 +11183,7 @@
             <w:rPr>
               <w:rFonts w:ascii="&quot;times new roman&quot;" w:eastAsia="&quot;times new roman&quot;" w:hAnsi="&quot;times new roman&quot;" w:cs="&quot;times new roman&quot;"/>
               <w:b/>
-              <w:sz w:val="21"/>
+              <w:sz w:val="24"/>
             </w:rPr>
             <w:t xml:space="preserve">Department</w:t>
           </w:r>
@@ -11205,15 +11200,15 @@
             <w:insideV w:val="single" w:sz="4" w:space="0" w:color="auto"/>
           </w:tcBorders>
           <w:tcMar>
-            <w:top w:w="75" w:type="dxa"/>
-            <w:left w:w="75" w:type="dxa"/>
-            <w:bottom w:w="75" w:type="dxa"/>
-            <w:right w:w="75" w:type="dxa"/>
+            <w:top w:w="16" w:type="dxa"/>
+            <w:left w:w="140" w:type="dxa"/>
+            <w:bottom w:w="16" w:type="dxa"/>
+            <w:right w:w="0" w:type="dxa"/>
           </w:tcMar>
         </w:tcPr>
         <w:p>
           <w:pPr>
-            <w:jc w:val="left"/>
+            <w:jc w:val="center"/>
             <w:rPr>
               <w:vanish w:val="0"/>
             </w:rPr>
@@ -11222,7 +11217,7 @@
             <w:rPr>
               <w:rFonts w:ascii="&quot;times new roman&quot;" w:eastAsia="&quot;times new roman&quot;" w:hAnsi="&quot;times new roman&quot;" w:cs="&quot;times new roman&quot;"/>
               <w:b/>
-              <w:sz w:val="21"/>
+              <w:sz w:val="24"/>
             </w:rPr>
             <w:t xml:space="preserve">PRODUCTION</w:t>
           </w:r>
@@ -11239,15 +11234,15 @@
             <w:insideV w:val="single" w:sz="4" w:space="0" w:color="auto"/>
           </w:tcBorders>
           <w:tcMar>
-            <w:top w:w="75" w:type="dxa"/>
-            <w:left w:w="75" w:type="dxa"/>
-            <w:bottom w:w="75" w:type="dxa"/>
-            <w:right w:w="75" w:type="dxa"/>
+            <w:top w:w="16" w:type="dxa"/>
+            <w:left w:w="140" w:type="dxa"/>
+            <w:bottom w:w="16" w:type="dxa"/>
+            <w:right w:w="0" w:type="dxa"/>
           </w:tcMar>
         </w:tcPr>
         <w:p>
           <w:pPr>
-            <w:jc w:val="left"/>
+            <w:jc w:val="center"/>
             <w:rPr>
               <w:vanish w:val="0"/>
             </w:rPr>
@@ -11256,7 +11251,7 @@
             <w:rPr>
               <w:rFonts w:ascii="&quot;times new roman&quot;" w:eastAsia="&quot;times new roman&quot;" w:hAnsi="&quot;times new roman&quot;" w:cs="&quot;times new roman&quot;"/>
               <w:b/>
-              <w:sz w:val="21"/>
+              <w:sz w:val="24"/>
             </w:rPr>
             <w:t xml:space="preserve">---</w:t>
           </w:r>
@@ -11273,15 +11268,15 @@
             <w:insideV w:val="single" w:sz="4" w:space="0" w:color="auto"/>
           </w:tcBorders>
           <w:tcMar>
-            <w:top w:w="75" w:type="dxa"/>
-            <w:left w:w="75" w:type="dxa"/>
-            <w:bottom w:w="75" w:type="dxa"/>
-            <w:right w:w="75" w:type="dxa"/>
+            <w:top w:w="16" w:type="dxa"/>
+            <w:left w:w="140" w:type="dxa"/>
+            <w:bottom w:w="16" w:type="dxa"/>
+            <w:right w:w="0" w:type="dxa"/>
           </w:tcMar>
         </w:tcPr>
         <w:p>
           <w:pPr>
-            <w:jc w:val="left"/>
+            <w:jc w:val="center"/>
             <w:rPr>
               <w:vanish w:val="0"/>
             </w:rPr>
@@ -11290,7 +11285,7 @@
             <w:rPr>
               <w:rFonts w:ascii="&quot;times new roman&quot;" w:eastAsia="&quot;times new roman&quot;" w:hAnsi="&quot;times new roman&quot;" w:cs="&quot;times new roman&quot;"/>
               <w:b/>
-              <w:sz w:val="21"/>
+              <w:sz w:val="24"/>
             </w:rPr>
             <w:t xml:space="preserve">PRODUCTION</w:t>
           </w:r>
@@ -11341,10 +11336,10 @@
             <w:insideV w:val="single" w:sz="4" w:space="0" w:color="auto"/>
           </w:tcBorders>
           <w:tcMar>
-            <w:top w:w="75" w:type="dxa"/>
-            <w:left w:w="75" w:type="dxa"/>
-            <w:bottom w:w="75" w:type="dxa"/>
-            <w:right w:w="75" w:type="dxa"/>
+            <w:top w:w="16" w:type="dxa"/>
+            <w:left w:w="140" w:type="dxa"/>
+            <w:bottom w:w="16" w:type="dxa"/>
+            <w:right w:w="0" w:type="dxa"/>
           </w:tcMar>
           <w:vAlign w:val="top"/>
         </w:tcPr>
@@ -11361,7 +11356,7 @@
               <w:b/>
               <w:sz w:val="14"/>
             </w:rPr>
-            <w:t xml:space="preserve">Format No : APD/QAD/SOP/sop1409</w:t>
+            <w:t xml:space="preserve">Format No : sdsdstpppp</w:t>
           </w:r>
         </w:p>
       </w:tc>
@@ -11478,10 +11473,10 @@
       <w:tblLook w:firstRow="0" w:lastRow="0" w:firstColumn="0" w:lastColumn="0" w:noHBand="1" w:noVBand="1"/>
     </w:tblPr>
     <w:tblGrid>
-      <w:gridCol w:w="1680"/>
-      <w:gridCol w:w="3733"/>
-      <w:gridCol w:w="2257"/>
-      <w:gridCol w:w="2761"/>
+      <w:gridCol w:w="2270"/>
+      <w:gridCol w:w="4336"/>
+      <w:gridCol w:w="2053"/>
+      <w:gridCol w:w="1773"/>
     </w:tblGrid>
     <w:tr>
       <w:trPr>
@@ -11500,16 +11495,16 @@
             <w:insideV w:val="single" w:sz="4" w:space="0" w:color="auto"/>
           </w:tcBorders>
           <w:tcMar>
-            <w:top w:w="75" w:type="dxa"/>
-            <w:left w:w="75" w:type="dxa"/>
-            <w:bottom w:w="75" w:type="dxa"/>
-            <w:right w:w="75" w:type="dxa"/>
+            <w:top w:w="16" w:type="dxa"/>
+            <w:left w:w="140" w:type="dxa"/>
+            <w:bottom w:w="16" w:type="dxa"/>
+            <w:right w:w="0" w:type="dxa"/>
           </w:tcMar>
           <w:vAlign w:val="top"/>
         </w:tcPr>
         <w:p>
           <w:pPr>
-            <w:pStyle w:val="SpireTableThStyle235a97f9-f38e-4783-b6a9-fe7f2817de2b"/>
+            <w:pStyle w:val="SpireTableThStyle89dd56ad-5791-40a9-a34d-7d19d343b5d4"/>
             <w:jc w:val="left"/>
             <w:rPr>
               <w:vanish w:val="0"/>
@@ -11536,7 +11531,7 @@
                 <v:path o:extrusionok="f" gradientshapeok="t" o:connecttype="rect"/>
                 <o:lock v:ext="edit" aspectratio="t"/>
               </v:shapetype>
-              <v:shape id="_x0000_i2049" type="#_x0000_t75" style="width:75pt;height:60pt">
+              <v:shape id="_x0000_i2049" type="#_x0000_t75" style="width:105pt;height:60pt">
                 <v:imagedata r:id="rId1" o:title=""/>
               </v:shape>
             </w:pict>
@@ -11555,16 +11550,16 @@
             <w:insideV w:val="single" w:sz="4" w:space="0" w:color="auto"/>
           </w:tcBorders>
           <w:tcMar>
-            <w:top w:w="75" w:type="dxa"/>
-            <w:left w:w="75" w:type="dxa"/>
-            <w:bottom w:w="75" w:type="dxa"/>
-            <w:right w:w="75" w:type="dxa"/>
+            <w:top w:w="16" w:type="dxa"/>
+            <w:left w:w="140" w:type="dxa"/>
+            <w:bottom w:w="16" w:type="dxa"/>
+            <w:right w:w="0" w:type="dxa"/>
           </w:tcMar>
           <w:vAlign w:val="top"/>
         </w:tcPr>
         <w:p>
           <w:pPr>
-            <w:pStyle w:val="SpireTableThStyle922bbfe3-6aa1-45c1-8c6b-993db7862ec6"/>
+            <w:pStyle w:val="SpireTableThStyle597fb399-6441-4f4d-ac97-a5b9b9446f09"/>
             <w:jc w:val="center"/>
             <w:rPr>
               <w:vanish w:val="0"/>
@@ -11574,7 +11569,7 @@
             <w:rPr>
               <w:rFonts w:ascii="&quot;times new roman&quot;" w:eastAsia="&quot;times new roman&quot;" w:hAnsi="&quot;times new roman&quot;" w:cs="&quot;times new roman&quot;"/>
               <w:b/>
-              <w:sz w:val="21"/>
+              <w:sz w:val="28"/>
             </w:rPr>
             <w:t xml:space="preserve">ACCENT PHARMACEUTICALS &amp; DIAGNOSTICS</w:t>
           </w:r>
@@ -11582,7 +11577,7 @@
             <w:rPr>
               <w:rFonts w:ascii="&quot;times new roman&quot;" w:eastAsia="&quot;times new roman&quot;" w:hAnsi="&quot;times new roman&quot;" w:cs="&quot;times new roman&quot;"/>
               <w:b/>
-              <w:sz w:val="21"/>
+              <w:sz w:val="28"/>
             </w:rPr>
             <w:br/>
           </w:r>
@@ -11590,7 +11585,7 @@
             <w:rPr>
               <w:rFonts w:ascii="&quot;times new roman&quot;" w:eastAsia="&quot;times new roman&quot;" w:hAnsi="&quot;times new roman&quot;" w:cs="&quot;times new roman&quot;"/>
               <w:b/>
-              <w:sz w:val="21"/>
+              <w:sz w:val="28"/>
             </w:rPr>
             <w:t xml:space="preserve">FOREST ROAD SOLAN, H.P. (INDIA)</w:t>
           </w:r>
@@ -11598,7 +11593,7 @@
             <w:rPr>
               <w:rFonts w:ascii="&quot;times new roman&quot;" w:eastAsia="&quot;times new roman&quot;" w:hAnsi="&quot;times new roman&quot;" w:cs="&quot;times new roman&quot;"/>
               <w:b/>
-              <w:sz w:val="21"/>
+              <w:sz w:val="28"/>
             </w:rPr>
             <w:br/>
           </w:r>
@@ -11606,15 +11601,15 @@
             <w:rPr>
               <w:rFonts w:ascii="&quot;times new roman&quot;" w:eastAsia="&quot;times new roman&quot;" w:hAnsi="&quot;times new roman&quot;" w:cs="&quot;times new roman&quot;"/>
               <w:b/>
-              <w:sz w:val="21"/>
+              <w:sz w:val="28"/>
             </w:rPr>
-            <w:t xml:space="preserve">Quality Assurance</w:t>
+            <w:t xml:space="preserve">Quality Control</w:t>
           </w:r>
           <w:r>
             <w:rPr>
               <w:rFonts w:ascii="&quot;times new roman&quot;" w:eastAsia="&quot;times new roman&quot;" w:hAnsi="&quot;times new roman&quot;" w:cs="&quot;times new roman&quot;"/>
               <w:b/>
-              <w:sz w:val="21"/>
+              <w:sz w:val="28"/>
             </w:rPr>
             <w:br/>
           </w:r>
@@ -11622,58 +11617,9 @@
             <w:rPr>
               <w:rFonts w:ascii="&quot;times new roman&quot;" w:eastAsia="&quot;times new roman&quot;" w:hAnsi="&quot;times new roman&quot;" w:cs="&quot;times new roman&quot;"/>
               <w:b/>
-              <w:sz w:val="21"/>
+              <w:sz w:val="28"/>
             </w:rPr>
-            <w:t xml:space="preserve">STANDARD OPERATING PROCEDURE</w:t>
-          </w:r>
-        </w:p>
-      </w:tc>
-    </w:tr>
-    <w:tr>
-      <w:trPr>
-        <w:trHeight w:hRule="auto" w:val="0"/>
-        <w:jc w:val="left"/>
-      </w:trPr>
-      <w:tc>
-        <w:tcPr>
-          <w:gridSpan w:val="4"/>
-          <w:tcBorders>
-            <w:top w:val="single" w:sz="6" w:space="0" w:color="auto"/>
-            <w:left w:val="single" w:sz="6" w:space="0" w:color="auto"/>
-            <w:bottom w:val="single" w:sz="6" w:space="0" w:color="auto"/>
-            <w:right w:val="single" w:sz="6" w:space="0" w:color="auto"/>
-            <w:insideH w:val="single" w:sz="4" w:space="0" w:color="auto"/>
-            <w:insideV w:val="single" w:sz="4" w:space="0" w:color="auto"/>
-          </w:tcBorders>
-          <w:tcMar>
-            <w:top w:w="75" w:type="dxa"/>
-            <w:left w:w="75" w:type="dxa"/>
-            <w:bottom w:w="75" w:type="dxa"/>
-            <w:right w:w="75" w:type="dxa"/>
-          </w:tcMar>
-        </w:tcPr>
-        <w:p>
-          <w:pPr>
-            <w:jc w:val="left"/>
-            <w:rPr>
-              <w:vanish w:val="0"/>
-            </w:rPr>
-          </w:pPr>
-          <w:r>
-            <w:rPr>
-              <w:rFonts w:ascii="&quot;times new roman&quot;" w:eastAsia="&quot;times new roman&quot;" w:hAnsi="&quot;times new roman&quot;" w:cs="&quot;times new roman&quot;"/>
-              <w:b/>
-              <w:sz w:val="18"/>
-            </w:rPr>
-            <w:t xml:space="preserve">Title:</w:t>
-          </w:r>
-          <w:r>
-            <w:rPr>
-              <w:rFonts w:ascii="&quot;times new roman&quot;" w:eastAsia="&quot;times new roman&quot;" w:hAnsi="&quot;times new roman&quot;" w:cs="&quot;times new roman&quot;"/>
-              <w:b/>
-              <w:sz w:val="18"/>
-            </w:rPr>
-            <w:t xml:space="preserve"> 1409 Title</w:t>
+            <w:t xml:space="preserve">STANDARD TESTING PROCEDURE</w:t>
           </w:r>
         </w:p>
       </w:tc>
@@ -11694,10 +11640,10 @@
             <w:insideV w:val="single" w:sz="4" w:space="0" w:color="auto"/>
           </w:tcBorders>
           <w:tcMar>
-            <w:top w:w="75" w:type="dxa"/>
-            <w:left w:w="75" w:type="dxa"/>
-            <w:bottom w:w="75" w:type="dxa"/>
-            <w:right w:w="75" w:type="dxa"/>
+            <w:top w:w="16" w:type="dxa"/>
+            <w:left w:w="140" w:type="dxa"/>
+            <w:bottom w:w="16" w:type="dxa"/>
+            <w:right w:w="0" w:type="dxa"/>
           </w:tcMar>
         </w:tcPr>
         <w:p>
@@ -11711,9 +11657,84 @@
             <w:rPr>
               <w:rFonts w:ascii="&quot;times new roman&quot;" w:eastAsia="&quot;times new roman&quot;" w:hAnsi="&quot;times new roman&quot;" w:cs="&quot;times new roman&quot;"/>
               <w:b/>
-              <w:sz w:val="21"/>
+              <w:sz w:val="24"/>
             </w:rPr>
-            <w:t xml:space="preserve">SOP No.</w:t>
+            <w:t xml:space="preserve">Generic Name</w:t>
+          </w:r>
+        </w:p>
+      </w:tc>
+      <w:tc>
+        <w:tcPr>
+          <w:gridSpan w:val="3"/>
+          <w:tcBorders>
+            <w:top w:val="single" w:sz="6" w:space="0" w:color="auto"/>
+            <w:left w:val="single" w:sz="6" w:space="0" w:color="auto"/>
+            <w:bottom w:val="single" w:sz="6" w:space="0" w:color="auto"/>
+            <w:right w:val="single" w:sz="6" w:space="0" w:color="auto"/>
+            <w:insideH w:val="single" w:sz="4" w:space="0" w:color="auto"/>
+            <w:insideV w:val="single" w:sz="4" w:space="0" w:color="auto"/>
+          </w:tcBorders>
+          <w:tcMar>
+            <w:top w:w="16" w:type="dxa"/>
+            <w:left w:w="140" w:type="dxa"/>
+            <w:bottom w:w="16" w:type="dxa"/>
+            <w:right w:w="0" w:type="dxa"/>
+          </w:tcMar>
+        </w:tcPr>
+        <w:p>
+          <w:pPr>
+            <w:jc w:val="left"/>
+            <w:rPr>
+              <w:vanish w:val="0"/>
+            </w:rPr>
+          </w:pPr>
+          <w:r>
+            <w:rPr>
+              <w:rFonts w:ascii="&quot;times new roman&quot;" w:eastAsia="&quot;times new roman&quot;" w:hAnsi="&quot;times new roman&quot;" w:cs="&quot;times new roman&quot;"/>
+              <w:b/>
+              <w:sz w:val="24"/>
+            </w:rPr>
+            <w:t xml:space="preserve">stp titleee</w:t>
+          </w:r>
+        </w:p>
+      </w:tc>
+    </w:tr>
+    <w:tr>
+      <w:trPr>
+        <w:trHeight w:hRule="auto" w:val="0"/>
+        <w:jc w:val="left"/>
+      </w:trPr>
+      <w:tc>
+        <w:tcPr>
+          <w:tcBorders>
+            <w:top w:val="single" w:sz="6" w:space="0" w:color="auto"/>
+            <w:left w:val="single" w:sz="6" w:space="0" w:color="auto"/>
+            <w:bottom w:val="single" w:sz="6" w:space="0" w:color="auto"/>
+            <w:right w:val="single" w:sz="6" w:space="0" w:color="auto"/>
+            <w:insideH w:val="single" w:sz="4" w:space="0" w:color="auto"/>
+            <w:insideV w:val="single" w:sz="4" w:space="0" w:color="auto"/>
+          </w:tcBorders>
+          <w:tcMar>
+            <w:top w:w="16" w:type="dxa"/>
+            <w:left w:w="140" w:type="dxa"/>
+            <w:bottom w:w="16" w:type="dxa"/>
+            <w:right w:w="0" w:type="dxa"/>
+          </w:tcMar>
+        </w:tcPr>
+        <w:p>
+          <w:pPr>
+            <w:jc w:val="left"/>
+            <w:rPr>
+              <w:vanish w:val="0"/>
+            </w:rPr>
+          </w:pPr>
+          <w:r>
+            <w:rPr>
+              <w:rFonts w:ascii="&quot;times new roman&quot;" w:eastAsia="&quot;times new roman&quot;" w:hAnsi="&quot;times new roman&quot;" w:cs="&quot;times new roman&quot;"/>
+              <w:b/>
+              <w:sz w:val="24"/>
+            </w:rPr>
+            <w:t xml:space="preserve">STP No.</w:t>
           </w:r>
         </w:p>
       </w:tc>
@@ -11728,10 +11749,10 @@
             <w:insideV w:val="single" w:sz="4" w:space="0" w:color="auto"/>
           </w:tcBorders>
           <w:tcMar>
-            <w:top w:w="75" w:type="dxa"/>
-            <w:left w:w="75" w:type="dxa"/>
-            <w:bottom w:w="75" w:type="dxa"/>
-            <w:right w:w="75" w:type="dxa"/>
+            <w:top w:w="16" w:type="dxa"/>
+            <w:left w:w="140" w:type="dxa"/>
+            <w:bottom w:w="16" w:type="dxa"/>
+            <w:right w:w="0" w:type="dxa"/>
           </w:tcMar>
         </w:tcPr>
         <w:p>
@@ -11745,9 +11766,9 @@
             <w:rPr>
               <w:rFonts w:ascii="&quot;times new roman&quot;" w:eastAsia="&quot;times new roman&quot;" w:hAnsi="&quot;times new roman&quot;" w:cs="&quot;times new roman&quot;"/>
               <w:b/>
-              <w:sz w:val="18"/>
+              <w:sz w:val="24"/>
             </w:rPr>
-            <w:t xml:space="preserve">APD/QAD/SOP-SOP1409</w:t>
+            <w:t xml:space="preserve">APD/QAD/SOP-01F1stpppp</w:t>
           </w:r>
         </w:p>
       </w:tc>
@@ -11762,10 +11783,10 @@
             <w:insideV w:val="single" w:sz="4" w:space="0" w:color="auto"/>
           </w:tcBorders>
           <w:tcMar>
-            <w:top w:w="75" w:type="dxa"/>
-            <w:left w:w="75" w:type="dxa"/>
-            <w:bottom w:w="75" w:type="dxa"/>
-            <w:right w:w="75" w:type="dxa"/>
+            <w:top w:w="16" w:type="dxa"/>
+            <w:left w:w="140" w:type="dxa"/>
+            <w:bottom w:w="16" w:type="dxa"/>
+            <w:right w:w="0" w:type="dxa"/>
           </w:tcMar>
         </w:tcPr>
         <w:p>
@@ -11779,7 +11800,7 @@
             <w:rPr>
               <w:rFonts w:ascii="&quot;times new roman&quot;" w:eastAsia="&quot;times new roman&quot;" w:hAnsi="&quot;times new roman&quot;" w:cs="&quot;times new roman&quot;"/>
               <w:b/>
-              <w:sz w:val="21"/>
+              <w:sz w:val="24"/>
             </w:rPr>
             <w:t xml:space="preserve">Revision No.</w:t>
           </w:r>
@@ -11796,10 +11817,10 @@
             <w:insideV w:val="single" w:sz="4" w:space="0" w:color="auto"/>
           </w:tcBorders>
           <w:tcMar>
-            <w:top w:w="75" w:type="dxa"/>
-            <w:left w:w="75" w:type="dxa"/>
-            <w:bottom w:w="75" w:type="dxa"/>
-            <w:right w:w="75" w:type="dxa"/>
+            <w:top w:w="16" w:type="dxa"/>
+            <w:left w:w="140" w:type="dxa"/>
+            <w:bottom w:w="16" w:type="dxa"/>
+            <w:right w:w="0" w:type="dxa"/>
           </w:tcMar>
         </w:tcPr>
         <w:p>
@@ -11813,7 +11834,7 @@
             <w:rPr>
               <w:rFonts w:ascii="&quot;times new roman&quot;" w:eastAsia="&quot;times new roman&quot;" w:hAnsi="&quot;times new roman&quot;" w:cs="&quot;times new roman&quot;"/>
               <w:b/>
-              <w:sz w:val="18"/>
+              <w:sz w:val="24"/>
             </w:rPr>
             <w:t xml:space="preserve">00</w:t>
           </w:r>
@@ -11836,10 +11857,10 @@
             <w:insideV w:val="single" w:sz="4" w:space="0" w:color="auto"/>
           </w:tcBorders>
           <w:tcMar>
-            <w:top w:w="75" w:type="dxa"/>
-            <w:left w:w="75" w:type="dxa"/>
-            <w:bottom w:w="75" w:type="dxa"/>
-            <w:right w:w="75" w:type="dxa"/>
+            <w:top w:w="16" w:type="dxa"/>
+            <w:left w:w="140" w:type="dxa"/>
+            <w:bottom w:w="16" w:type="dxa"/>
+            <w:right w:w="0" w:type="dxa"/>
           </w:tcMar>
         </w:tcPr>
         <w:p>
@@ -11853,9 +11874,9 @@
             <w:rPr>
               <w:rFonts w:ascii="&quot;times new roman&quot;" w:eastAsia="&quot;times new roman&quot;" w:hAnsi="&quot;times new roman&quot;" w:cs="&quot;times new roman&quot;"/>
               <w:b/>
-              <w:sz w:val="21"/>
+              <w:sz w:val="24"/>
             </w:rPr>
-            <w:t xml:space="preserve">Supersedes</w:t>
+            <w:t xml:space="preserve">Supersedes No.</w:t>
           </w:r>
         </w:p>
       </w:tc>
@@ -11870,10 +11891,10 @@
             <w:insideV w:val="single" w:sz="4" w:space="0" w:color="auto"/>
           </w:tcBorders>
           <w:tcMar>
-            <w:top w:w="75" w:type="dxa"/>
-            <w:left w:w="75" w:type="dxa"/>
-            <w:bottom w:w="75" w:type="dxa"/>
-            <w:right w:w="75" w:type="dxa"/>
+            <w:top w:w="16" w:type="dxa"/>
+            <w:left w:w="140" w:type="dxa"/>
+            <w:bottom w:w="16" w:type="dxa"/>
+            <w:right w:w="0" w:type="dxa"/>
           </w:tcMar>
         </w:tcPr>
         <w:p>
@@ -11887,7 +11908,7 @@
             <w:rPr>
               <w:rFonts w:ascii="&quot;times new roman&quot;" w:eastAsia="&quot;times new roman&quot;" w:hAnsi="&quot;times new roman&quot;" w:cs="&quot;times new roman&quot;"/>
               <w:b/>
-              <w:sz w:val="18"/>
+              <w:sz w:val="24"/>
             </w:rPr>
             <w:t xml:space="preserve">01</w:t>
           </w:r>
@@ -11904,10 +11925,10 @@
             <w:insideV w:val="single" w:sz="4" w:space="0" w:color="auto"/>
           </w:tcBorders>
           <w:tcMar>
-            <w:top w:w="75" w:type="dxa"/>
-            <w:left w:w="75" w:type="dxa"/>
-            <w:bottom w:w="75" w:type="dxa"/>
-            <w:right w:w="75" w:type="dxa"/>
+            <w:top w:w="16" w:type="dxa"/>
+            <w:left w:w="140" w:type="dxa"/>
+            <w:bottom w:w="16" w:type="dxa"/>
+            <w:right w:w="0" w:type="dxa"/>
           </w:tcMar>
         </w:tcPr>
         <w:p>
@@ -11921,9 +11942,9 @@
             <w:rPr>
               <w:rFonts w:ascii="&quot;times new roman&quot;" w:eastAsia="&quot;times new roman&quot;" w:hAnsi="&quot;times new roman&quot;" w:cs="&quot;times new roman&quot;"/>
               <w:b/>
-              <w:sz w:val="21"/>
+              <w:sz w:val="24"/>
             </w:rPr>
-            <w:t xml:space="preserve">Department</w:t>
+            <w:t xml:space="preserve">Reference</w:t>
           </w:r>
         </w:p>
       </w:tc>
@@ -11938,10 +11959,10 @@
             <w:insideV w:val="single" w:sz="4" w:space="0" w:color="auto"/>
           </w:tcBorders>
           <w:tcMar>
-            <w:top w:w="75" w:type="dxa"/>
-            <w:left w:w="75" w:type="dxa"/>
-            <w:bottom w:w="75" w:type="dxa"/>
-            <w:right w:w="75" w:type="dxa"/>
+            <w:top w:w="16" w:type="dxa"/>
+            <w:left w:w="140" w:type="dxa"/>
+            <w:bottom w:w="16" w:type="dxa"/>
+            <w:right w:w="0" w:type="dxa"/>
           </w:tcMar>
         </w:tcPr>
         <w:p>
@@ -11955,9 +11976,9 @@
             <w:rPr>
               <w:rFonts w:ascii="&quot;times new roman&quot;" w:eastAsia="&quot;times new roman&quot;" w:hAnsi="&quot;times new roman&quot;" w:cs="&quot;times new roman&quot;"/>
               <w:b/>
-              <w:sz w:val="18"/>
+              <w:sz w:val="24"/>
             </w:rPr>
-            <w:t xml:space="preserve">Quality Assurance</w:t>
+            <w:t xml:space="preserve">nil</w:t>
           </w:r>
         </w:p>
       </w:tc>
@@ -11978,10 +11999,10 @@
             <w:insideV w:val="single" w:sz="4" w:space="0" w:color="auto"/>
           </w:tcBorders>
           <w:tcMar>
-            <w:top w:w="75" w:type="dxa"/>
-            <w:left w:w="75" w:type="dxa"/>
-            <w:bottom w:w="75" w:type="dxa"/>
-            <w:right w:w="75" w:type="dxa"/>
+            <w:top w:w="16" w:type="dxa"/>
+            <w:left w:w="140" w:type="dxa"/>
+            <w:bottom w:w="16" w:type="dxa"/>
+            <w:right w:w="0" w:type="dxa"/>
           </w:tcMar>
         </w:tcPr>
         <w:p>
@@ -11995,7 +12016,149 @@
             <w:rPr>
               <w:rFonts w:ascii="&quot;times new roman&quot;" w:eastAsia="&quot;times new roman&quot;" w:hAnsi="&quot;times new roman&quot;" w:cs="&quot;times new roman&quot;"/>
               <w:b/>
-              <w:sz w:val="21"/>
+              <w:sz w:val="24"/>
+            </w:rPr>
+            <w:t xml:space="preserve">Sample Quality</w:t>
+          </w:r>
+        </w:p>
+      </w:tc>
+      <w:tc>
+        <w:tcPr>
+          <w:tcBorders>
+            <w:top w:val="single" w:sz="6" w:space="0" w:color="auto"/>
+            <w:left w:val="single" w:sz="6" w:space="0" w:color="auto"/>
+            <w:bottom w:val="single" w:sz="6" w:space="0" w:color="auto"/>
+            <w:right w:val="single" w:sz="6" w:space="0" w:color="auto"/>
+            <w:insideH w:val="single" w:sz="4" w:space="0" w:color="auto"/>
+            <w:insideV w:val="single" w:sz="4" w:space="0" w:color="auto"/>
+          </w:tcBorders>
+          <w:tcMar>
+            <w:top w:w="16" w:type="dxa"/>
+            <w:left w:w="140" w:type="dxa"/>
+            <w:bottom w:w="16" w:type="dxa"/>
+            <w:right w:w="0" w:type="dxa"/>
+          </w:tcMar>
+        </w:tcPr>
+        <w:p>
+          <w:pPr>
+            <w:jc w:val="left"/>
+            <w:rPr>
+              <w:vanish w:val="0"/>
+            </w:rPr>
+          </w:pPr>
+          <w:r>
+            <w:rPr>
+              <w:rFonts w:ascii="&quot;times new roman&quot;" w:eastAsia="&quot;times new roman&quot;" w:hAnsi="&quot;times new roman&quot;" w:cs="&quot;times new roman&quot;"/>
+              <w:b/>
+              <w:sz w:val="24"/>
+            </w:rPr>
+            <w:t xml:space="preserve">250mg</w:t>
+          </w:r>
+        </w:p>
+      </w:tc>
+      <w:tc>
+        <w:tcPr>
+          <w:tcBorders>
+            <w:top w:val="single" w:sz="6" w:space="0" w:color="auto"/>
+            <w:left w:val="single" w:sz="6" w:space="0" w:color="auto"/>
+            <w:bottom w:val="single" w:sz="6" w:space="0" w:color="auto"/>
+            <w:right w:val="single" w:sz="6" w:space="0" w:color="auto"/>
+            <w:insideH w:val="single" w:sz="4" w:space="0" w:color="auto"/>
+            <w:insideV w:val="single" w:sz="4" w:space="0" w:color="auto"/>
+          </w:tcBorders>
+          <w:tcMar>
+            <w:top w:w="16" w:type="dxa"/>
+            <w:left w:w="140" w:type="dxa"/>
+            <w:bottom w:w="16" w:type="dxa"/>
+            <w:right w:w="0" w:type="dxa"/>
+          </w:tcMar>
+        </w:tcPr>
+        <w:p>
+          <w:pPr>
+            <w:jc w:val="left"/>
+            <w:rPr>
+              <w:vanish w:val="0"/>
+            </w:rPr>
+          </w:pPr>
+          <w:r>
+            <w:rPr>
+              <w:rFonts w:ascii="&quot;times new roman&quot;" w:eastAsia="&quot;times new roman&quot;" w:hAnsi="&quot;times new roman&quot;" w:cs="&quot;times new roman&quot;"/>
+              <w:b/>
+              <w:sz w:val="24"/>
+            </w:rPr>
+            <w:t xml:space="preserve">Label Claim</w:t>
+          </w:r>
+        </w:p>
+      </w:tc>
+      <w:tc>
+        <w:tcPr>
+          <w:tcBorders>
+            <w:top w:val="single" w:sz="6" w:space="0" w:color="auto"/>
+            <w:left w:val="single" w:sz="6" w:space="0" w:color="auto"/>
+            <w:bottom w:val="single" w:sz="6" w:space="0" w:color="auto"/>
+            <w:right w:val="single" w:sz="6" w:space="0" w:color="auto"/>
+            <w:insideH w:val="single" w:sz="4" w:space="0" w:color="auto"/>
+            <w:insideV w:val="single" w:sz="4" w:space="0" w:color="auto"/>
+          </w:tcBorders>
+          <w:tcMar>
+            <w:top w:w="16" w:type="dxa"/>
+            <w:left w:w="140" w:type="dxa"/>
+            <w:bottom w:w="16" w:type="dxa"/>
+            <w:right w:w="0" w:type="dxa"/>
+          </w:tcMar>
+        </w:tcPr>
+        <w:p>
+          <w:pPr>
+            <w:jc w:val="left"/>
+            <w:rPr>
+              <w:vanish w:val="0"/>
+            </w:rPr>
+          </w:pPr>
+          <w:r>
+            <w:rPr>
+              <w:rFonts w:ascii="&quot;times new roman&quot;" w:eastAsia="&quot;times new roman&quot;" w:hAnsi="&quot;times new roman&quot;" w:cs="&quot;times new roman&quot;"/>
+              <w:b/>
+              <w:sz w:val="24"/>
+            </w:rPr>
+            <w:t xml:space="preserve">nil</w:t>
+          </w:r>
+        </w:p>
+      </w:tc>
+    </w:tr>
+    <w:tr>
+      <w:trPr>
+        <w:trHeight w:hRule="auto" w:val="0"/>
+        <w:jc w:val="left"/>
+      </w:trPr>
+      <w:tc>
+        <w:tcPr>
+          <w:tcBorders>
+            <w:top w:val="single" w:sz="6" w:space="0" w:color="auto"/>
+            <w:left w:val="single" w:sz="6" w:space="0" w:color="auto"/>
+            <w:bottom w:val="single" w:sz="6" w:space="0" w:color="auto"/>
+            <w:right w:val="single" w:sz="6" w:space="0" w:color="auto"/>
+            <w:insideH w:val="single" w:sz="4" w:space="0" w:color="auto"/>
+            <w:insideV w:val="single" w:sz="4" w:space="0" w:color="auto"/>
+          </w:tcBorders>
+          <w:tcMar>
+            <w:top w:w="16" w:type="dxa"/>
+            <w:left w:w="140" w:type="dxa"/>
+            <w:bottom w:w="16" w:type="dxa"/>
+            <w:right w:w="0" w:type="dxa"/>
+          </w:tcMar>
+        </w:tcPr>
+        <w:p>
+          <w:pPr>
+            <w:jc w:val="left"/>
+            <w:rPr>
+              <w:vanish w:val="0"/>
+            </w:rPr>
+          </w:pPr>
+          <w:r>
+            <w:rPr>
+              <w:rFonts w:ascii="&quot;times new roman&quot;" w:eastAsia="&quot;times new roman&quot;" w:hAnsi="&quot;times new roman&quot;" w:cs="&quot;times new roman&quot;"/>
+              <w:b/>
+              <w:sz w:val="24"/>
             </w:rPr>
             <w:t xml:space="preserve">Effective Date</w:t>
           </w:r>
@@ -12012,10 +12175,10 @@
             <w:insideV w:val="single" w:sz="4" w:space="0" w:color="auto"/>
           </w:tcBorders>
           <w:tcMar>
-            <w:top w:w="75" w:type="dxa"/>
-            <w:left w:w="75" w:type="dxa"/>
-            <w:bottom w:w="75" w:type="dxa"/>
-            <w:right w:w="75" w:type="dxa"/>
+            <w:top w:w="16" w:type="dxa"/>
+            <w:left w:w="140" w:type="dxa"/>
+            <w:bottom w:w="16" w:type="dxa"/>
+            <w:right w:w="0" w:type="dxa"/>
           </w:tcMar>
         </w:tcPr>
         <w:p>
@@ -12029,9 +12192,9 @@
             <w:rPr>
               <w:rFonts w:ascii="&quot;times new roman&quot;" w:eastAsia="&quot;times new roman&quot;" w:hAnsi="&quot;times new roman&quot;" w:cs="&quot;times new roman&quot;"/>
               <w:b/>
-              <w:sz w:val="18"/>
+              <w:sz w:val="24"/>
             </w:rPr>
-            <w:t xml:space="preserve">14/09/2024</w:t>
+            <w:t xml:space="preserve">16/09/2024</w:t>
           </w:r>
         </w:p>
       </w:tc>
@@ -12046,10 +12209,10 @@
             <w:insideV w:val="single" w:sz="4" w:space="0" w:color="auto"/>
           </w:tcBorders>
           <w:tcMar>
-            <w:top w:w="75" w:type="dxa"/>
-            <w:left w:w="75" w:type="dxa"/>
-            <w:bottom w:w="75" w:type="dxa"/>
-            <w:right w:w="75" w:type="dxa"/>
+            <w:top w:w="16" w:type="dxa"/>
+            <w:left w:w="140" w:type="dxa"/>
+            <w:bottom w:w="16" w:type="dxa"/>
+            <w:right w:w="0" w:type="dxa"/>
           </w:tcMar>
         </w:tcPr>
         <w:p>
@@ -12063,7 +12226,7 @@
             <w:rPr>
               <w:rFonts w:ascii="&quot;times new roman&quot;" w:eastAsia="&quot;times new roman&quot;" w:hAnsi="&quot;times new roman&quot;" w:cs="&quot;times new roman&quot;"/>
               <w:b/>
-              <w:sz w:val="21"/>
+              <w:sz w:val="24"/>
             </w:rPr>
             <w:t xml:space="preserve">Review Date</w:t>
           </w:r>
@@ -12080,10 +12243,10 @@
             <w:insideV w:val="single" w:sz="4" w:space="0" w:color="auto"/>
           </w:tcBorders>
           <w:tcMar>
-            <w:top w:w="75" w:type="dxa"/>
-            <w:left w:w="75" w:type="dxa"/>
-            <w:bottom w:w="75" w:type="dxa"/>
-            <w:right w:w="75" w:type="dxa"/>
+            <w:top w:w="16" w:type="dxa"/>
+            <w:left w:w="140" w:type="dxa"/>
+            <w:bottom w:w="16" w:type="dxa"/>
+            <w:right w:w="0" w:type="dxa"/>
           </w:tcMar>
         </w:tcPr>
         <w:p>
@@ -12097,9 +12260,9 @@
             <w:rPr>
               <w:rFonts w:ascii="&quot;times new roman&quot;" w:eastAsia="&quot;times new roman&quot;" w:hAnsi="&quot;times new roman&quot;" w:cs="&quot;times new roman&quot;"/>
               <w:b/>
-              <w:sz w:val="18"/>
+              <w:sz w:val="24"/>
             </w:rPr>
-            <w:t xml:space="preserve">15/09/2024</w:t>
+            <w:t xml:space="preserve">17/09/2024</w:t>
           </w:r>
         </w:p>
       </w:tc>
@@ -14652,7 +14815,7 @@
   </w:style>
   <w:style w:type="character" w:customStyle="1" w:styleId="HeaderChar">
     <w:name w:val="Header Char"/>
-    <w:aliases w:val=" Char Char Char Char Char Char, Char Char Char Char Char Char Char Char, Char Char Char Char1, Char Char Char3, Char Char3,Char Char Char Char,Char Char Char Char Char Char Char Char,Char Char Char Char Char Char1,Char Char Char1,Char Char3"/>
+    <w:aliases w:val=" Char Char Char Char, Char Char Char Char Char Char, Char Char Char Char Char Char Char Char, Char Char Char1, Char Char1,Char Char Char Char,Char Char Char Char Char Char,Char Char Char Char Char Char Char Char,Char Char Char1,Char Char1"/>
     <w:basedOn w:val="DefaultParagraphFont"/>
     <w:link w:val="Header"/>
     <w:rsid w:val="00583576"/>
@@ -14663,8 +14826,8 @@
       <w:szCs w:val="24"/>
     </w:rPr>
   </w:style>
-  <w:style w:type="paragraph" w:styleId="SpireTableThStylef19c4701-188b-4527-bf04-aa3599ab3e1f">
-    <w:name w:val="SpireTableThStylef19c4701-188b-4527-bf04-aa3599ab3e1f"/>
+  <w:style w:type="paragraph" w:styleId="SpireTableThStyle57247c50-495b-4fae-824c-23ec4621684f">
+    <w:name w:val="SpireTableThStyle57247c50-495b-4fae-824c-23ec4621684f"/>
     <w:basedOn w:val="Normal"/>
     <w:qFormat/>
     <w:pPr>
@@ -14680,8 +14843,8 @@
       <w:lang w:val="en-US"/>
     </w:rPr>
   </w:style>
-  <w:style w:type="paragraph" w:styleId="SpireTableThStylee651c194-71be-4483-bfad-106b72612678">
-    <w:name w:val="SpireTableThStylee651c194-71be-4483-bfad-106b72612678"/>
+  <w:style w:type="paragraph" w:styleId="SpireTableThStyle78ea8cc0-127c-467c-82a0-acd754a42ee8">
+    <w:name w:val="SpireTableThStyle78ea8cc0-127c-467c-82a0-acd754a42ee8"/>
     <w:basedOn w:val="Normal"/>
     <w:qFormat/>
     <w:pPr>
@@ -14697,8 +14860,8 @@
       <w:lang w:val="en-US"/>
     </w:rPr>
   </w:style>
-  <w:style w:type="paragraph" w:styleId="SpireTableThStyle7c09a6f3-fc76-4c12-94a5-ff1fd3cd6391">
-    <w:name w:val="SpireTableThStyle7c09a6f3-fc76-4c12-94a5-ff1fd3cd6391"/>
+  <w:style w:type="paragraph" w:styleId="SpireTableThStyle1349b3a3-57aa-4ec2-8965-ed168f1ab5df">
+    <w:name w:val="SpireTableThStyle1349b3a3-57aa-4ec2-8965-ed168f1ab5df"/>
     <w:basedOn w:val="Normal"/>
     <w:qFormat/>
     <w:pPr>
@@ -14714,8 +14877,8 @@
       <w:lang w:val="en-US"/>
     </w:rPr>
   </w:style>
-  <w:style w:type="paragraph" w:styleId="SpireTableThStylef8f4f3f3-96a1-4b1c-8c3d-53a10253a537">
-    <w:name w:val="SpireTableThStylef8f4f3f3-96a1-4b1c-8c3d-53a10253a537"/>
+  <w:style w:type="paragraph" w:styleId="SpireTableThStyleb74160e4-164a-4bdb-af11-2e3315db5247">
+    <w:name w:val="SpireTableThStyleb74160e4-164a-4bdb-af11-2e3315db5247"/>
     <w:basedOn w:val="Normal"/>
     <w:qFormat/>
     <w:pPr>
@@ -14731,8 +14894,8 @@
       <w:lang w:val="en-US"/>
     </w:rPr>
   </w:style>
-  <w:style w:type="paragraph" w:styleId="SpireTableThStyle2f3c2f67-45d1-4af5-8599-f8572be4f8a7">
-    <w:name w:val="SpireTableThStyle2f3c2f67-45d1-4af5-8599-f8572be4f8a7"/>
+  <w:style w:type="paragraph" w:styleId="SpireTableThStyle8c685bca-0258-4110-99d4-33703147a4ab">
+    <w:name w:val="SpireTableThStyle8c685bca-0258-4110-99d4-33703147a4ab"/>
     <w:basedOn w:val="Normal"/>
     <w:qFormat/>
     <w:pPr>
@@ -14748,8 +14911,8 @@
       <w:lang w:val="en-US"/>
     </w:rPr>
   </w:style>
-  <w:style w:type="paragraph" w:styleId="SpireTableThStyle6e4413a3-dd26-4997-93e0-36d6e5596f9b">
-    <w:name w:val="SpireTableThStyle6e4413a3-dd26-4997-93e0-36d6e5596f9b"/>
+  <w:style w:type="paragraph" w:styleId="SpireTableThStyle5c0fc8d8-3484-462c-b770-ea2d18f3fd3f">
+    <w:name w:val="SpireTableThStyle5c0fc8d8-3484-462c-b770-ea2d18f3fd3f"/>
     <w:basedOn w:val="Normal"/>
     <w:qFormat/>
     <w:pPr>
@@ -14765,8 +14928,8 @@
       <w:lang w:val="en-US"/>
     </w:rPr>
   </w:style>
-  <w:style w:type="paragraph" w:styleId="SpireTableThStyled7eb7b53-8881-4400-b562-5ae70a7172cd">
-    <w:name w:val="SpireTableThStyled7eb7b53-8881-4400-b562-5ae70a7172cd"/>
+  <w:style w:type="paragraph" w:styleId="SpireTableThStylec583315a-e7d0-4bda-b2b3-b6c05bf383cf">
+    <w:name w:val="SpireTableThStylec583315a-e7d0-4bda-b2b3-b6c05bf383cf"/>
     <w:basedOn w:val="Normal"/>
     <w:qFormat/>
     <w:pPr>
@@ -14782,8 +14945,8 @@
       <w:lang w:val="en-US"/>
     </w:rPr>
   </w:style>
-  <w:style w:type="paragraph" w:styleId="SpireTableThStyle235a97f9-f38e-4783-b6a9-fe7f2817de2b">
-    <w:name w:val="SpireTableThStyle235a97f9-f38e-4783-b6a9-fe7f2817de2b"/>
+  <w:style w:type="paragraph" w:styleId="SpireTableThStyle89dd56ad-5791-40a9-a34d-7d19d343b5d4">
+    <w:name w:val="SpireTableThStyle89dd56ad-5791-40a9-a34d-7d19d343b5d4"/>
     <w:basedOn w:val="Normal"/>
     <w:qFormat/>
     <w:pPr>
@@ -14799,8 +14962,8 @@
       <w:lang w:val="en-US"/>
     </w:rPr>
   </w:style>
-  <w:style w:type="paragraph" w:styleId="SpireTableThStyle922bbfe3-6aa1-45c1-8c6b-993db7862ec6">
-    <w:name w:val="SpireTableThStyle922bbfe3-6aa1-45c1-8c6b-993db7862ec6"/>
+  <w:style w:type="paragraph" w:styleId="SpireTableThStyle597fb399-6441-4f4d-ac97-a5b9b9446f09">
+    <w:name w:val="SpireTableThStyle597fb399-6441-4f4d-ac97-a5b9b9446f09"/>
     <w:basedOn w:val="Normal"/>
     <w:qFormat/>
     <w:pPr>

</xml_diff>